<commit_message>
updated lit review and analyse od
</commit_message>
<xml_diff>
--- a/Lit review format.docx
+++ b/Lit review format.docx
@@ -147,6 +147,7 @@
         <w:t xml:space="preserve">Define cost of resistance </w:t>
       </w:r>
     </w:p>
+    <w:p/>
     <w:p>
       <w:r>
         <w:t xml:space="preserve">Define pleiotropy </w:t>
@@ -254,7 +255,6 @@
           <w:b/>
           <w:bCs/>
         </w:rPr>
-        <w:lastRenderedPageBreak/>
         <w:t>Temperature</w:t>
       </w:r>
       <w:r>
@@ -336,6 +336,9 @@
         <w:spacing w:after="80" w:line="300" w:lineRule="auto"/>
         <w:ind w:left="540"/>
         <w:contextualSpacing w:val="0"/>
+        <w:rPr>
+          <w:color w:val="555555"/>
+        </w:rPr>
       </w:pPr>
       <w:proofErr w:type="spellStart"/>
       <w:r>
@@ -350,6 +353,20 @@
           <w:color w:val="555555"/>
         </w:rPr>
         <w:t xml:space="preserve"> et al. (2013): cross-stress resistance in E. coli — strains evolved under one stressor gain resistance to others; shared transcriptional regulators underlie cross-protection</w:t>
+      </w:r>
+    </w:p>
+    <w:p>
+      <w:pPr>
+        <w:pStyle w:val="ListParagraph"/>
+        <w:spacing w:after="80" w:line="300" w:lineRule="auto"/>
+        <w:ind w:left="540"/>
+        <w:contextualSpacing w:val="0"/>
+      </w:pPr>
+      <w:r>
+        <w:rPr>
+          <w:color w:val="555555"/>
+        </w:rPr>
+        <w:t xml:space="preserve">Evolutionary rescue </w:t>
       </w:r>
     </w:p>
     <w:p/>
@@ -655,7 +672,6 @@
           <w:b/>
           <w:bCs/>
         </w:rPr>
-        <w:lastRenderedPageBreak/>
         <w:t xml:space="preserve">What literature has discovered about </w:t>
       </w:r>
       <w:proofErr w:type="spellStart"/>
@@ -959,6 +975,36 @@
           <w:bCs/>
         </w:rPr>
         <w:t>:</w:t>
+      </w:r>
+    </w:p>
+    <w:p>
+      <w:pPr>
+        <w:rPr>
+          <w:b/>
+          <w:bCs/>
+        </w:rPr>
+      </w:pPr>
+      <w:r>
+        <w:rPr>
+          <w:b/>
+          <w:bCs/>
+        </w:rPr>
+        <w:t xml:space="preserve">We see sharp drop off in m9 which is due to the solo glucose resource  </w:t>
+      </w:r>
+    </w:p>
+    <w:p>
+      <w:pPr>
+        <w:rPr>
+          <w:b/>
+          <w:bCs/>
+        </w:rPr>
+      </w:pPr>
+      <w:r>
+        <w:rPr>
+          <w:b/>
+          <w:bCs/>
+        </w:rPr>
+        <w:t xml:space="preserve">We see a smoother drop off in LB due to the rich media </w:t>
       </w:r>
     </w:p>
     <w:p>

</xml_diff>